<commit_message>
docs: update demo docx file (#94)
Co-authored-by: Claude Opus 4.6 <noreply@anthropic.com>
</commit_message>
<xml_diff>
--- a/examples/vite/public/docx-editor-demo.docx
+++ b/examples/vite/public/docx-editor-demo.docx
@@ -4,11 +4,6 @@
   <w:body>
     <w:p>
       <w:pPr>
-        <w:spacing w:before="0" w:after="0"/>
-      </w:pPr>
-    </w:p>
-    <w:p>
-      <w:pPr>
         <w:spacing w:before="0" w:after="20"/>
       </w:pPr>
       <w:r>
@@ -36,6 +31,11 @@
         </w:rPr>
         <w:t>Project Charter &amp; Contributor Agreement</w:t>
       </w:r>
+    </w:p>
+    <w:p>
+      <w:pPr>
+        <w:spacing w:after="60"/>
+      </w:pPr>
     </w:p>
     <w:tbl>
       <w:tblPr>
@@ -144,11 +144,6 @@
         </w:tc>
       </w:tr>
     </w:tbl>
-    <w:p>
-      <w:pPr>
-        <w:spacing w:before="160" w:after="0"/>
-      </w:pPr>
-    </w:p>
     <w:p>
       <w:pPr>
         <w:pBdr>
@@ -2078,19 +2073,9 @@
       </w:pPr>
     </w:p>
     <w:p>
-      <w:pPr>
-        <w:spacing w:before="180" w:after="40"/>
-      </w:pPr>
-    </w:p>
-    <w:p>
-      <w:pPr>
-        <w:spacing w:before="180" w:after="40"/>
-      </w:pPr>
-    </w:p>
-    <w:p>
-      <w:pPr>
-        <w:spacing w:before="180" w:after="40"/>
-      </w:pPr>
+      <w:r>
+        <w:br w:type="page"/>
+      </w:r>
     </w:p>
     <w:p>
       <w:pPr>
@@ -2829,7 +2814,7 @@
         <w:sz w:val="20"/>
         <w:szCs w:val="20"/>
       </w:rPr>
-      <w:instrText xml:space="preserve"> PAGE \* MERGEFORMAT </w:instrText>
+      <w:instrText>PAGE \* MERGEFORMAT</w:instrText>
     </w:r>
     <w:r>
       <w:rPr>
@@ -2883,7 +2868,7 @@
         <w:sz w:val="20"/>
         <w:szCs w:val="20"/>
       </w:rPr>
-      <w:instrText xml:space="preserve"> NUMPAGES \* MERGEFORMAT </w:instrText>
+      <w:instrText>NUMPAGES \* MERGEFORMAT</w:instrText>
     </w:r>
     <w:r>
       <w:rPr>

</xml_diff>